<commit_message>
Add Sales and Products page and update documentation
</commit_message>
<xml_diff>
--- a/DataCo Proyect.docx
+++ b/DataCo Proyect.docx
@@ -836,6 +836,161 @@
         </w:rPr>
         <w:t xml:space="preserve"> with sales under $2M. Fitness stands out as a clear outlier in sales volume at approximately $7M making it the backbone of revenue despite not having the highest margin.</w:t>
       </w:r>
+    </w:p>
+    <w:p>
+      <w:pPr>
+        <w:rPr>
+          <w:lang w:val="en-US"/>
+        </w:rPr>
+      </w:pPr>
+    </w:p>
+    <w:p>
+      <w:pPr>
+        <w:rPr>
+          <w:b/>
+          <w:bCs/>
+          <w:lang w:val="en-US"/>
+        </w:rPr>
+      </w:pPr>
+      <w:r>
+        <w:rPr>
+          <w:b/>
+          <w:bCs/>
+          <w:lang w:val="en-US"/>
+        </w:rPr>
+        <w:lastRenderedPageBreak/>
+        <w:t>Page 3: Sales and Products</w:t>
+      </w:r>
+    </w:p>
+    <w:p>
+      <w:pPr>
+        <w:rPr>
+          <w:lang w:val="en-US"/>
+        </w:rPr>
+      </w:pPr>
+      <w:r>
+        <w:rPr>
+          <w:lang w:val="en-US"/>
+        </w:rPr>
+        <w:t>KPIs: Total Sales $36.8M | Total Orders 66K | Total Quantity 384K</w:t>
+      </w:r>
+    </w:p>
+    <w:p>
+      <w:pPr>
+        <w:rPr>
+          <w:lang w:val="en-US"/>
+        </w:rPr>
+      </w:pPr>
+      <w:r>
+        <w:rPr>
+          <w:lang w:val="en-US"/>
+        </w:rPr>
+        <w:t>Visuals created: Total Sales by Department Name with drill down using the Product Hierarchy. Total Orders by Geography with drill down using the Geography Hierarchy from Market to City. Total Sales trend by Year using the Date Hierarchy. Scatter Plot showing Total Quantity vs Total Sales by Category Name segmented by Department Name.</w:t>
+      </w:r>
+    </w:p>
+    <w:p>
+      <w:pPr>
+        <w:rPr>
+          <w:lang w:val="en-US"/>
+        </w:rPr>
+      </w:pPr>
+      <w:r>
+        <w:rPr>
+          <w:lang w:val="en-US"/>
+        </w:rPr>
+        <w:t xml:space="preserve">Key Insights: Fan Shop </w:t>
+      </w:r>
+      <w:proofErr w:type="gramStart"/>
+      <w:r>
+        <w:rPr>
+          <w:lang w:val="en-US"/>
+        </w:rPr>
+        <w:t>leads</w:t>
+      </w:r>
+      <w:proofErr w:type="gramEnd"/>
+      <w:r>
+        <w:rPr>
+          <w:lang w:val="en-US"/>
+        </w:rPr>
+        <w:t xml:space="preserve"> total sales at approximately $20M, nearly double Apparel in second place despite Apparel moving more units. This confirms Fan Shop sells higher price point products. The top three </w:t>
+      </w:r>
+      <w:proofErr w:type="gramStart"/>
+      <w:r>
+        <w:rPr>
+          <w:lang w:val="en-US"/>
+        </w:rPr>
+        <w:t>departments</w:t>
+      </w:r>
+      <w:proofErr w:type="gramEnd"/>
+      <w:r>
+        <w:rPr>
+          <w:lang w:val="en-US"/>
+        </w:rPr>
+        <w:t xml:space="preserve"> Fan Shop, Apparel and </w:t>
+      </w:r>
+      <w:proofErr w:type="gramStart"/>
+      <w:r>
+        <w:rPr>
+          <w:lang w:val="en-US"/>
+        </w:rPr>
+        <w:t>Golf</w:t>
+      </w:r>
+      <w:proofErr w:type="gramEnd"/>
+      <w:r>
+        <w:rPr>
+          <w:lang w:val="en-US"/>
+        </w:rPr>
+        <w:t xml:space="preserve"> concentrate </w:t>
+      </w:r>
+      <w:proofErr w:type="gramStart"/>
+      <w:r>
+        <w:rPr>
+          <w:lang w:val="en-US"/>
+        </w:rPr>
+        <w:t>the majority of</w:t>
+      </w:r>
+      <w:proofErr w:type="gramEnd"/>
+      <w:r>
+        <w:rPr>
+          <w:lang w:val="en-US"/>
+        </w:rPr>
+        <w:t xml:space="preserve"> sales volume, consistent with the Pareto principle where a small number of products drive most revenue. Fitness </w:t>
+      </w:r>
+      <w:proofErr w:type="gramStart"/>
+      <w:r>
+        <w:rPr>
+          <w:lang w:val="en-US"/>
+        </w:rPr>
+        <w:t>moves</w:t>
+      </w:r>
+      <w:proofErr w:type="gramEnd"/>
+      <w:r>
+        <w:rPr>
+          <w:lang w:val="en-US"/>
+        </w:rPr>
+        <w:t xml:space="preserve"> the highest number of units at approximately 80K but at lower price points, positioning it as a </w:t>
+      </w:r>
+      <w:proofErr w:type="gramStart"/>
+      <w:r>
+        <w:rPr>
+          <w:lang w:val="en-US"/>
+        </w:rPr>
+        <w:t>high volume</w:t>
+      </w:r>
+      <w:proofErr w:type="gramEnd"/>
+      <w:r>
+        <w:rPr>
+          <w:lang w:val="en-US"/>
+        </w:rPr>
+        <w:t xml:space="preserve"> low margin department. The United States leads total orders by a significant margin, followed by France and Mexico. Sales grew consistently from 2015 to 2017 reaching approximately $11M annually, followed by a sharp drop in 2018 to $331K. This anomaly likely reflects incomplete data for 2018 rather than a definitive business collapse, though it warrants further investigation with additional context outside the dataset.</w:t>
+      </w:r>
+    </w:p>
+    <w:p>
+      <w:pPr>
+        <w:rPr>
+          <w:lang w:val="en-US"/>
+        </w:rPr>
+      </w:pPr>
     </w:p>
     <w:p>
       <w:pPr>

</xml_diff>

<commit_message>
Add dasboard screenshots and complete all 4 pages documentation
</commit_message>
<xml_diff>
--- a/DataCo Proyect.docx
+++ b/DataCo Proyect.docx
@@ -983,6 +983,76 @@
           <w:lang w:val="en-US"/>
         </w:rPr>
         <w:t xml:space="preserve"> low margin department. The United States leads total orders by a significant margin, followed by France and Mexico. Sales grew consistently from 2015 to 2017 reaching approximately $11M annually, followed by a sharp drop in 2018 to $331K. This anomaly likely reflects incomplete data for 2018 rather than a definitive business collapse, though it warrants further investigation with additional context outside the dataset.</w:t>
+      </w:r>
+    </w:p>
+    <w:p>
+      <w:pPr>
+        <w:rPr>
+          <w:b/>
+          <w:bCs/>
+          <w:lang w:val="en-US"/>
+        </w:rPr>
+      </w:pPr>
+      <w:r>
+        <w:rPr>
+          <w:b/>
+          <w:bCs/>
+          <w:lang w:val="en-US"/>
+        </w:rPr>
+        <w:t>Page 4: Customer Analysis</w:t>
+      </w:r>
+    </w:p>
+    <w:p>
+      <w:pPr>
+        <w:rPr>
+          <w:lang w:val="en-US"/>
+        </w:rPr>
+      </w:pPr>
+      <w:r>
+        <w:rPr>
+          <w:lang w:val="en-US"/>
+        </w:rPr>
+        <w:t>KPIs: Total Customers 21K | Total Orders 66K | Avg Order Value $559.45</w:t>
+      </w:r>
+    </w:p>
+    <w:p>
+      <w:pPr>
+        <w:rPr>
+          <w:lang w:val="en-US"/>
+        </w:rPr>
+      </w:pPr>
+      <w:r>
+        <w:rPr>
+          <w:lang w:val="en-US"/>
+        </w:rPr>
+        <w:t>Visuals created: Total Orders by Customer Segment. Total Sales by Customer Segment. Total Orders by Payment Type (Donut Chart). Late Delivery Rate % by Customer Segment. Total Orders by Customer Country.</w:t>
+      </w:r>
+    </w:p>
+    <w:p>
+      <w:pPr>
+        <w:rPr>
+          <w:lang w:val="en-US"/>
+        </w:rPr>
+      </w:pPr>
+      <w:r>
+        <w:rPr>
+          <w:lang w:val="en-US"/>
+        </w:rPr>
+        <w:t xml:space="preserve">Key Insights: Consumer is the dominant segment in both total orders and total sales, followed by Corporate and Home Office respectively. The proportion remains consistent across both metrics, indicating that the average order value is similar across all three segments with no segment buying at significantly higher price points than others. Late Delivery Rate is virtually identical across all customer segments at approximately 54% to 55%, with Home Office showing a marginally higher rate. This confirms that the delivery problem is systemic and does not discriminate </w:t>
+      </w:r>
+      <w:proofErr w:type="gramStart"/>
+      <w:r>
+        <w:rPr>
+          <w:lang w:val="en-US"/>
+        </w:rPr>
+        <w:t>by</w:t>
+      </w:r>
+      <w:proofErr w:type="gramEnd"/>
+      <w:r>
+        <w:rPr>
+          <w:lang w:val="en-US"/>
+        </w:rPr>
+        <w:t xml:space="preserve"> customer type. The United States leads total orders by customer country, followed by Puerto Rico. Since Puerto Rico is a US territory treated as a separate country in the dataset, combining both would make the US dominance even more pronounced. Debit is the most popular payment method at 38.54%, consistent with a business where Consumer is the dominant segment and online card payments are preferred. Bank transfer follows at 27.49%, likely driven by Corporate and Home Office segments that prefer institutional payment methods.</w:t>
       </w:r>
     </w:p>
     <w:p>

</xml_diff>